<commit_message>
Answer the improvement question directly: paired test of rival lookbacks
Beyond robustness: is a better MA setting being left on the table?
Paired daily-return test of 250d/275d vs the deployed 200d blend
(sharpest available test — variants hold near-identical portfolios,
daily correlation 0.99): 275d leads by +0.83%/yr at t = 1.20
(Newey-West), needing ~21 more years of data for 2 sigma BEFORE any
haircut for being the max of 13 trials; 250d worse (t = 1.07). Combined
with the walk-forward result (every real-time capture process loses),
the lookback has no harvestable improvement at this sample size. Memo
section 1d added; summary docx question box now poses and answers both
questions (fitted-to-past AND better-setting-available).
</commit_message>
<xml_diff>
--- a/reviews/2026-07-03_ws0-ws1_ma-robustness_summary.docx
+++ b/reviews/2026-07-03_ws0-ws1_ma-robustness_summary.docx
@@ -94,7 +94,7 @@
                 <w:sz w:val="21"/>
                 <w:szCs w:val="21"/>
               </w:rPr>
-              <w:t xml:space="preserve">The question</w:t>
+              <w:t xml:space="preserve">The questions</w:t>
             </w:r>
           </w:p>
         </w:tc>
@@ -125,7 +125,7 @@
                 <w:sz w:val="21"/>
                 <w:szCs w:val="21"/>
               </w:rPr>
-              <w:t xml:space="preserve">The strategy was built by trial and error on 2018-2026 data. Are any of its settings fitted to the past rather than genuinely robust?</w:t>
+              <w:t xml:space="preserve">The strategy was built by trial and error on 2018-2026 data. Two questions follow: are any of its settings fitted to the past rather than genuinely robust — and is a better setting being left on the table?</w:t>
             </w:r>
           </w:p>
         </w:tc>
@@ -159,7 +159,7 @@
                 <w:sz w:val="21"/>
                 <w:szCs w:val="21"/>
               </w:rPr>
-              <w:t xml:space="preserve">The answer</w:t>
+              <w:t xml:space="preserve">The answers</w:t>
             </w:r>
           </w:p>
         </w:tc>
@@ -190,7 +190,7 @@
                 <w:sz w:val="21"/>
                 <w:szCs w:val="21"/>
               </w:rPr>
-              <w:t xml:space="preserve">No setting was changed. Every setting sits in a broad stable range, and all ~139 tested 'improvements' did worse on data the models had never seen.</w:t>
+              <w:t xml:space="preserve">No and no. Every setting sits in a broad stable range; all ~139 tested 'improvements' did worse on data the models had never seen; and the best rival setting is statistically indistinguishable from the current one — its apparent edge would need about two more decades of data to be confirmed, and no real-time process captures it.</w:t>
             </w:r>
           </w:p>
         </w:tc>
@@ -263,7 +263,7 @@
     </w:tbl>
     <w:p>
       <w:pPr>
-        <w:spacing w:after="100" w:line="264"/>
+        <w:spacing w:after="80" w:line="264"/>
       </w:pPr>
       <w:r>
         <w:t xml:space="preserve"/>
@@ -271,13 +271,13 @@
     </w:p>
     <w:p>
       <w:pPr>
-        <w:spacing w:after="160" w:before="40"/>
+        <w:spacing w:after="110" w:before="30"/>
         <w:jc w:val="center"/>
       </w:pPr>
       <w:r>
         <w:drawing>
           <wp:inline distT="0" distB="0" distL="0" distR="0">
-            <wp:extent cx="5905500" cy="2000250"/>
+            <wp:extent cx="5524500" cy="1866900"/>
             <wp:effectExtent t="0" r="0" b="0" l="0"/>
             <wp:docPr id="1" name="ws1_sum_structure.png" descr="One portfolio of four rotation books with weights, plus two safety mechanisms" title="One portfolio of four rotation books with weights, plus two safety mechanisms"/>
             <wp:cNvGraphicFramePr>
@@ -302,7 +302,7 @@
                   <pic:spPr bwMode="auto">
                     <a:xfrm>
                       <a:off x="0" y="0"/>
-                      <a:ext cx="5905500" cy="2000250"/>
+                      <a:ext cx="5524500" cy="1866900"/>
                     </a:xfrm>
                     <a:prstGeom prst="rect">
                       <a:avLst/>
@@ -344,13 +344,13 @@
     </w:p>
     <w:p>
       <w:pPr>
-        <w:spacing w:after="160" w:before="40"/>
+        <w:spacing w:after="110" w:before="30"/>
         <w:jc w:val="center"/>
       </w:pPr>
       <w:r>
         <w:drawing>
           <wp:inline distT="0" distB="0" distL="0" distR="0">
-            <wp:extent cx="5810250" cy="2876550"/>
+            <wp:extent cx="5524500" cy="2733675"/>
             <wp:effectExtent t="0" r="0" b="0" l="0"/>
             <wp:docPr id="1" name="ws1_blend_surface_simple.png" descr="Risk-adjusted return versus trend length: slower is better and the current setting sits in the stable zone" title="Risk-adjusted return versus trend length: slower is better and the current setting sits in the stable zone"/>
             <wp:cNvGraphicFramePr>
@@ -375,7 +375,7 @@
                   <pic:spPr bwMode="auto">
                     <a:xfrm>
                       <a:off x="0" y="0"/>
-                      <a:ext cx="5810250" cy="2876550"/>
+                      <a:ext cx="5524500" cy="2733675"/>
                     </a:xfrm>
                     <a:prstGeom prst="rect">
                       <a:avLst/>
@@ -390,7 +390,7 @@
     </w:p>
     <w:p>
       <w:pPr>
-        <w:spacing w:after="200" w:line="264"/>
+        <w:spacing w:after="150" w:line="264"/>
       </w:pPr>
       <w:r>
         <w:rPr>
@@ -400,7 +400,7 @@
           <w:sz w:val="18"/>
           <w:szCs w:val="18"/>
         </w:rPr>
-        <w:t xml:space="preserve">Risk-adjusted return = Sharpe ratio (return per unit of volatility; higher is better). On 7.6 years of data, differences under about 0.4 are statistical noise.</w:t>
+        <w:t xml:space="preserve">Risk-adjusted return = Sharpe ratio (return per volatility; higher is better; differences under ~0.4 here are noise). Even the best rival setting (275 days) leads by only +0.8%/yr — one standard error from zero; confirming it would take about two more decades of data.</w:t>
       </w:r>
     </w:p>
     <w:p>
@@ -432,13 +432,13 @@
     </w:p>
     <w:p>
       <w:pPr>
-        <w:spacing w:after="160" w:before="40"/>
+        <w:spacing w:after="110" w:before="30"/>
         <w:jc w:val="center"/>
       </w:pPr>
       <w:r>
         <w:drawing>
           <wp:inline distT="0" distB="0" distL="0" distR="0">
-            <wp:extent cx="5810250" cy="1676400"/>
+            <wp:extent cx="5524500" cy="1590675"/>
             <wp:effectExtent t="0" r="0" b="0" l="0"/>
             <wp:docPr id="1" name="ws1_sum_retuning.png" descr="Re-tuning the trend speed yearly earned less than leaving the deployed setting alone" title="Re-tuning the trend speed yearly earned less than leaving the deployed setting alone"/>
             <wp:cNvGraphicFramePr>
@@ -463,7 +463,7 @@
                   <pic:spPr bwMode="auto">
                     <a:xfrm>
                       <a:off x="0" y="0"/>
-                      <a:ext cx="5810250" cy="1676400"/>
+                      <a:ext cx="5524500" cy="1590675"/>
                     </a:xfrm>
                     <a:prstGeom prst="rect">
                       <a:avLst/>
@@ -505,13 +505,13 @@
     </w:p>
     <w:p>
       <w:pPr>
-        <w:spacing w:after="160" w:before="40"/>
+        <w:spacing w:after="110" w:before="30"/>
         <w:jc w:val="center"/>
       </w:pPr>
       <w:r>
         <w:drawing>
           <wp:inline distT="0" distB="0" distL="0" distR="0">
-            <wp:extent cx="5810250" cy="1371600"/>
+            <wp:extent cx="5524500" cy="1304925"/>
             <wp:effectExtent t="0" r="0" b="0" l="0"/>
             <wp:docPr id="1" name="ws1_sum_smarter.png" descr="The deployed simple signal matches the best alternative and far exceeds the fully sophisticated version" title="The deployed simple signal matches the best alternative and far exceeds the fully sophisticated version"/>
             <wp:cNvGraphicFramePr>
@@ -536,7 +536,7 @@
                   <pic:spPr bwMode="auto">
                     <a:xfrm>
                       <a:off x="0" y="0"/>
-                      <a:ext cx="5810250" cy="1371600"/>
+                      <a:ext cx="5524500" cy="1304925"/>
                     </a:xfrm>
                     <a:prstGeom prst="rect">
                       <a:avLst/>
@@ -578,13 +578,13 @@
     </w:p>
     <w:p>
       <w:pPr>
-        <w:spacing w:after="160" w:before="40"/>
+        <w:spacing w:after="110" w:before="30"/>
         <w:jc w:val="center"/>
       </w:pPr>
       <w:r>
         <w:drawing>
           <wp:inline distT="0" distB="0" distL="0" distR="0">
-            <wp:extent cx="5810250" cy="1657350"/>
+            <wp:extent cx="5524500" cy="1581150"/>
             <wp:effectExtent t="0" r="0" b="0" l="0"/>
             <wp:docPr id="1" name="ws1_sum_brake.png" descr="The market-breadth brake improves risk-adjusted return and worst loss at every trigger setting tested" title="The market-breadth brake improves risk-adjusted return and worst loss at every trigger setting tested"/>
             <wp:cNvGraphicFramePr>
@@ -609,7 +609,7 @@
                   <pic:spPr bwMode="auto">
                     <a:xfrm>
                       <a:off x="0" y="0"/>
-                      <a:ext cx="5810250" cy="1657350"/>
+                      <a:ext cx="5524500" cy="1581150"/>
                     </a:xfrm>
                     <a:prstGeom prst="rect">
                       <a:avLst/>
@@ -651,13 +651,13 @@
     </w:p>
     <w:p>
       <w:pPr>
-        <w:spacing w:after="160" w:before="40"/>
+        <w:spacing w:after="110" w:before="30"/>
         <w:jc w:val="center"/>
       </w:pPr>
       <w:r>
         <w:drawing>
           <wp:inline distT="0" distB="0" distL="0" distR="0">
-            <wp:extent cx="5810250" cy="1762125"/>
+            <wp:extent cx="5524500" cy="1676400"/>
             <wp:effectExtent t="0" r="0" b="0" l="0"/>
             <wp:docPr id="1" name="ws1_sum_thematic.png" descr="Removing the thematic entry hurdle improves return but unacceptably deepens worst loss" title="Removing the thematic entry hurdle improves return but unacceptably deepens worst loss"/>
             <wp:cNvGraphicFramePr>
@@ -682,7 +682,7 @@
                   <pic:spPr bwMode="auto">
                     <a:xfrm>
                       <a:off x="0" y="0"/>
-                      <a:ext cx="5810250" cy="1762125"/>
+                      <a:ext cx="5524500" cy="1676400"/>
                     </a:xfrm>
                     <a:prstGeom prst="rect">
                       <a:avLst/>

</xml_diff>

<commit_message>
Summary: add appendix showing the extent of the settings work
Two-page appendix at the back of the plain-language summary (front three
pages unchanged): A1 a new scope tally graphic (141 combinations tested
across seven categories -> 0 changed -> 2 flagged), A2 the full per-book
trend-length surface, A3 the drawdown surface, A4 the two safety-dial
threshold maps. Each carries a plain-language caption translating the
working labels; no raw tables. Closing pointer to the universe and
robustness-haircut records.
</commit_message>
<xml_diff>
--- a/reviews/2026-07-03_ws0-ws1_ma-robustness_summary.docx
+++ b/reviews/2026-07-03_ws0-ws1_ma-robustness_summary.docx
@@ -744,6 +744,354 @@
     </w:p>
     <w:p>
       <w:pPr>
+        <w:pStyle w:val="Heading1"/>
+        <w:pageBreakBefore/>
+      </w:pPr>
+      <w:r>
+        <w:t xml:space="preserve">Appendix — the work behind the summary</w:t>
+      </w:r>
+    </w:p>
+    <w:p>
+      <w:pPr>
+        <w:spacing w:after="160" w:line="264"/>
+      </w:pPr>
+      <w:r>
+        <w:rPr>
+          <w:color w:val="444444"/>
+          <w:sz w:val="20"/>
+          <w:szCs w:val="20"/>
+        </w:rPr>
+        <w:t xml:space="preserve">These are the working charts behind the five findings, included to show the depth of testing. The labels are technical — the shapes and colours carry the message, and each caption says what to look for. The four books are US sectors (A), global asset classes (B), thematics (C) and European sectors (D).</w:t>
+      </w:r>
+    </w:p>
+    <w:p>
+      <w:pPr>
+        <w:keepNext/>
+        <w:spacing w:after="40" w:line="264"/>
+      </w:pPr>
+      <w:r>
+        <w:rPr>
+          <w:b/>
+          <w:bCs/>
+          <w:sz w:val="23"/>
+          <w:szCs w:val="23"/>
+        </w:rPr>
+        <w:t xml:space="preserve">A1. Everything that was tested.</w:t>
+      </w:r>
+    </w:p>
+    <w:p>
+      <w:pPr>
+        <w:spacing w:after="110" w:before="30"/>
+        <w:jc w:val="center"/>
+      </w:pPr>
+      <w:r>
+        <w:drawing>
+          <wp:inline distT="0" distB="0" distL="0" distR="0">
+            <wp:extent cx="5715000" cy="2438400"/>
+            <wp:effectExtent t="0" r="0" b="0" l="0"/>
+            <wp:docPr id="1" name="ws1_sum_scope.png" descr="141 settings combinations tested across seven categories, zero changes made" title="141 settings combinations tested across seven categories, zero changes made"/>
+            <wp:cNvGraphicFramePr>
+              <a:graphicFrameLocks xmlns:a="http://schemas.openxmlformats.org/drawingml/2006/main" noChangeAspect="1"/>
+            </wp:cNvGraphicFramePr>
+            <a:graphic xmlns:a="http://schemas.openxmlformats.org/drawingml/2006/main">
+              <a:graphicData uri="http://schemas.openxmlformats.org/drawingml/2006/picture">
+                <pic:pic xmlns:pic="http://schemas.openxmlformats.org/drawingml/2006/picture">
+                  <pic:nvPicPr>
+                    <pic:cNvPr id="0" name="" descr=""/>
+                    <pic:cNvPicPr>
+                      <a:picLocks noChangeAspect="1" noChangeArrowheads="1"/>
+                    </pic:cNvPicPr>
+                  </pic:nvPicPr>
+                  <pic:blipFill>
+                    <a:blip r:embed="rId15" cstate="none"/>
+                    <a:srcRect/>
+                    <a:stretch>
+                      <a:fillRect/>
+                    </a:stretch>
+                  </pic:blipFill>
+                  <pic:spPr bwMode="auto">
+                    <a:xfrm>
+                      <a:off x="0" y="0"/>
+                      <a:ext cx="5715000" cy="2438400"/>
+                    </a:xfrm>
+                    <a:prstGeom prst="rect">
+                      <a:avLst/>
+                    </a:prstGeom>
+                  </pic:spPr>
+                </pic:pic>
+              </a:graphicData>
+            </a:graphic>
+          </wp:inline>
+        </w:drawing>
+      </w:r>
+    </w:p>
+    <w:p>
+      <w:pPr>
+        <w:spacing w:after="200" w:line="264"/>
+      </w:pPr>
+      <w:r>
+        <w:rPr>
+          <w:i/>
+          <w:iCs/>
+          <w:color w:val="666666"/>
+          <w:sz w:val="18"/>
+          <w:szCs w:val="18"/>
+        </w:rPr>
+        <w:t xml:space="preserve">Every important setting was swept across a grid of alternatives. No test produced a change worth making; two close calls were carried to the final robustness review.</w:t>
+      </w:r>
+    </w:p>
+    <w:p>
+      <w:pPr>
+        <w:keepNext/>
+        <w:spacing w:after="40" w:line="264"/>
+      </w:pPr>
+      <w:r>
+        <w:rPr>
+          <w:b/>
+          <w:bCs/>
+          <w:sz w:val="23"/>
+          <w:szCs w:val="23"/>
+        </w:rPr>
+        <w:t xml:space="preserve">A2. The trend-length test, in full.</w:t>
+      </w:r>
+    </w:p>
+    <w:p>
+      <w:pPr>
+        <w:spacing w:after="110" w:before="30"/>
+        <w:jc w:val="center"/>
+      </w:pPr>
+      <w:r>
+        <w:drawing>
+          <wp:inline distT="0" distB="0" distL="0" distR="0">
+            <wp:extent cx="5715000" cy="3171825"/>
+            <wp:effectExtent t="0" r="0" b="0" l="0"/>
+            <wp:docPr id="1" name="ws1_ma_surface.png" descr="Risk-adjusted return versus trend length for each of the four books and the whole portfolio, on the full window and both halves" title="Risk-adjusted return versus trend length for each of the four books and the whole portfolio, on the full window and both halves"/>
+            <wp:cNvGraphicFramePr>
+              <a:graphicFrameLocks xmlns:a="http://schemas.openxmlformats.org/drawingml/2006/main" noChangeAspect="1"/>
+            </wp:cNvGraphicFramePr>
+            <a:graphic xmlns:a="http://schemas.openxmlformats.org/drawingml/2006/main">
+              <a:graphicData uri="http://schemas.openxmlformats.org/drawingml/2006/picture">
+                <pic:pic xmlns:pic="http://schemas.openxmlformats.org/drawingml/2006/picture">
+                  <pic:nvPicPr>
+                    <pic:cNvPr id="0" name="" descr=""/>
+                    <pic:cNvPicPr>
+                      <a:picLocks noChangeAspect="1" noChangeArrowheads="1"/>
+                    </pic:cNvPicPr>
+                  </pic:nvPicPr>
+                  <pic:blipFill>
+                    <a:blip r:embed="rId16" cstate="none"/>
+                    <a:srcRect/>
+                    <a:stretch>
+                      <a:fillRect/>
+                    </a:stretch>
+                  </pic:blipFill>
+                  <pic:spPr bwMode="auto">
+                    <a:xfrm>
+                      <a:off x="0" y="0"/>
+                      <a:ext cx="5715000" cy="3171825"/>
+                    </a:xfrm>
+                    <a:prstGeom prst="rect">
+                      <a:avLst/>
+                    </a:prstGeom>
+                  </pic:spPr>
+                </pic:pic>
+              </a:graphicData>
+            </a:graphic>
+          </wp:inline>
+        </w:drawing>
+      </w:r>
+    </w:p>
+    <w:p>
+      <w:pPr>
+        <w:spacing w:after="200" w:line="264"/>
+      </w:pPr>
+      <w:r>
+        <w:rPr>
+          <w:i/>
+          <w:iCs/>
+          <w:color w:val="666666"/>
+          <w:sz w:val="18"/>
+          <w:szCs w:val="18"/>
+        </w:rPr>
+        <w:t xml:space="preserve">The same result holds book by book, and on both the first and second halves of history (the two lighter lines in each panel) — not just for the portfolio overall. Flat and slightly rising into the shaded stable zone; the current setting is the vertical dashed line.</w:t>
+      </w:r>
+    </w:p>
+    <w:p>
+      <w:pPr>
+        <w:keepNext/>
+        <w:spacing w:after="40" w:line="264"/>
+      </w:pPr>
+      <w:r>
+        <w:rPr>
+          <w:b/>
+          <w:bCs/>
+          <w:sz w:val="23"/>
+          <w:szCs w:val="23"/>
+        </w:rPr>
+        <w:t xml:space="preserve">A3. The same question, asked of losses.</w:t>
+      </w:r>
+    </w:p>
+    <w:p>
+      <w:pPr>
+        <w:spacing w:after="110" w:before="30"/>
+        <w:jc w:val="center"/>
+      </w:pPr>
+      <w:r>
+        <w:drawing>
+          <wp:inline distT="0" distB="0" distL="0" distR="0">
+            <wp:extent cx="5715000" cy="1981200"/>
+            <wp:effectExtent t="0" r="0" b="0" l="0"/>
+            <wp:docPr id="1" name="ws1_ma_dd_surface.png" descr="Portfolio drawdown measures versus trend length" title="Portfolio drawdown measures versus trend length"/>
+            <wp:cNvGraphicFramePr>
+              <a:graphicFrameLocks xmlns:a="http://schemas.openxmlformats.org/drawingml/2006/main" noChangeAspect="1"/>
+            </wp:cNvGraphicFramePr>
+            <a:graphic xmlns:a="http://schemas.openxmlformats.org/drawingml/2006/main">
+              <a:graphicData uri="http://schemas.openxmlformats.org/drawingml/2006/picture">
+                <pic:pic xmlns:pic="http://schemas.openxmlformats.org/drawingml/2006/picture">
+                  <pic:nvPicPr>
+                    <pic:cNvPr id="0" name="" descr=""/>
+                    <pic:cNvPicPr>
+                      <a:picLocks noChangeAspect="1" noChangeArrowheads="1"/>
+                    </pic:cNvPicPr>
+                  </pic:nvPicPr>
+                  <pic:blipFill>
+                    <a:blip r:embed="rId17" cstate="none"/>
+                    <a:srcRect/>
+                    <a:stretch>
+                      <a:fillRect/>
+                    </a:stretch>
+                  </pic:blipFill>
+                  <pic:spPr bwMode="auto">
+                    <a:xfrm>
+                      <a:off x="0" y="0"/>
+                      <a:ext cx="5715000" cy="1981200"/>
+                    </a:xfrm>
+                    <a:prstGeom prst="rect">
+                      <a:avLst/>
+                    </a:prstGeom>
+                  </pic:spPr>
+                </pic:pic>
+              </a:graphicData>
+            </a:graphic>
+          </wp:inline>
+        </w:drawing>
+      </w:r>
+    </w:p>
+    <w:p>
+      <w:pPr>
+        <w:spacing w:after="200" w:line="264"/>
+      </w:pPr>
+      <w:r>
+        <w:rPr>
+          <w:i/>
+          <w:iCs/>
+          <w:color w:val="666666"/>
+          <w:sz w:val="18"/>
+          <w:szCs w:val="18"/>
+        </w:rPr>
+        <w:t xml:space="preserve">Worst 12-month loss and the depth of the 2022 drawdown both improve as the trend measure slows. The deepest single loss — the 2020 COVID crash — is the same at every setting, because no trend measure is fast enough to dodge a one-month crash. That is the safety brake's job, not the trend dial's.</w:t>
+      </w:r>
+    </w:p>
+    <w:p>
+      <w:pPr>
+        <w:keepNext/>
+        <w:spacing w:after="40" w:line="264"/>
+      </w:pPr>
+      <w:r>
+        <w:rPr>
+          <w:b/>
+          <w:bCs/>
+          <w:sz w:val="23"/>
+          <w:szCs w:val="23"/>
+        </w:rPr>
+        <w:t xml:space="preserve">A4. The two safety dials, fully mapped.</w:t>
+      </w:r>
+    </w:p>
+    <w:p>
+      <w:pPr>
+        <w:spacing w:after="110" w:before="30"/>
+        <w:jc w:val="center"/>
+      </w:pPr>
+      <w:r>
+        <w:drawing>
+          <wp:inline distT="0" distB="0" distL="0" distR="0">
+            <wp:extent cx="5715000" cy="1714500"/>
+            <wp:effectExtent t="0" r="0" b="0" l="0"/>
+            <wp:docPr id="1" name="ws1_threshold_surface.png" descr="Threshold surfaces for the thematic entry hurdle, its out-of-sample version, and the market-breadth brake" title="Threshold surfaces for the thematic entry hurdle, its out-of-sample version, and the market-breadth brake"/>
+            <wp:cNvGraphicFramePr>
+              <a:graphicFrameLocks xmlns:a="http://schemas.openxmlformats.org/drawingml/2006/main" noChangeAspect="1"/>
+            </wp:cNvGraphicFramePr>
+            <a:graphic xmlns:a="http://schemas.openxmlformats.org/drawingml/2006/main">
+              <a:graphicData uri="http://schemas.openxmlformats.org/drawingml/2006/picture">
+                <pic:pic xmlns:pic="http://schemas.openxmlformats.org/drawingml/2006/picture">
+                  <pic:nvPicPr>
+                    <pic:cNvPr id="0" name="" descr=""/>
+                    <pic:cNvPicPr>
+                      <a:picLocks noChangeAspect="1" noChangeArrowheads="1"/>
+                    </pic:cNvPicPr>
+                  </pic:nvPicPr>
+                  <pic:blipFill>
+                    <a:blip r:embed="rId18" cstate="none"/>
+                    <a:srcRect/>
+                    <a:stretch>
+                      <a:fillRect/>
+                    </a:stretch>
+                  </pic:blipFill>
+                  <pic:spPr bwMode="auto">
+                    <a:xfrm>
+                      <a:off x="0" y="0"/>
+                      <a:ext cx="5715000" cy="1714500"/>
+                    </a:xfrm>
+                    <a:prstGeom prst="rect">
+                      <a:avLst/>
+                    </a:prstGeom>
+                  </pic:spPr>
+                </pic:pic>
+              </a:graphicData>
+            </a:graphic>
+          </wp:inline>
+        </w:drawing>
+      </w:r>
+    </w:p>
+    <w:p>
+      <w:pPr>
+        <w:spacing w:after="160" w:line="264"/>
+      </w:pPr>
+      <w:r>
+        <w:rPr>
+          <w:i/>
+          <w:iCs/>
+          <w:color w:val="666666"/>
+          <w:sz w:val="18"/>
+          <w:szCs w:val="18"/>
+        </w:rPr>
+        <w:t xml:space="preserve">Left and centre — the thematic book's entry hurdle: the settings that look best on all history (left) fade on unseen data (centre), which is why removing the hurdle was declined. Right — the market-breadth brake: every trigger combination (all shades of green) beats running without it.</w:t>
+      </w:r>
+    </w:p>
+    <w:p>
+      <w:pPr>
+        <w:spacing w:after="160" w:line="264"/>
+      </w:pPr>
+      <w:r>
+        <w:rPr>
+          <w:b/>
+          <w:bCs/>
+          <w:sz w:val="21"/>
+          <w:szCs w:val="21"/>
+        </w:rPr>
+        <w:t xml:space="preserve">The wider programme.</w:t>
+      </w:r>
+      <w:r>
+        <w:rPr>
+          <w:color w:val="444444"/>
+          <w:sz w:val="20"/>
+          <w:szCs w:val="20"/>
+        </w:rPr>
+        <w:t xml:space="preserve">  This review covered the strategy's settings. Two further reviews — the fund universe (which holdings to include) and an overall robustness haircut across the whole search history — were completed separately and have their own records.</w:t>
+      </w:r>
+    </w:p>
+    <w:p>
+      <w:pPr>
         <w:spacing w:after="60" w:line="264"/>
       </w:pPr>
       <w:r>

</xml_diff>

<commit_message>
Summary A4: show thresholds as in-sample vs out-of-sample, with an overfit map
Replaces the appendix threshold figure with one that makes the split legible,
answering "why not the darker cell". Each dial now has three panels: first
half of history (in-sample), second half (out-of-sample, same colour scale),
and the difference (in minus out). The thematic hurdle's dark high-trigger
cells go orange out-of-sample and light up red on the difference map (fitted
to the past); the deployed cell holds and stays pale. The market-breadth brake
is blue throughout (held up or improved out of sample), so its small
differences are noise. The one genuinely-robust better cell (remove the +5%
hurdle, not overfit) is flagged as a drawdown trade, consistent with page 3.

New reproducible generator: threshold_split() in
scripts/plot_ws1_summary_charts.py -> data/ws1_threshold_summary.png. The
technical record's chart (ws1_threshold_surface.png) is unchanged.
</commit_message>
<xml_diff>
--- a/reviews/2026-07-03_ws0-ws1_ma-robustness_summary.docx
+++ b/reviews/2026-07-03_ws0-ws1_ma-robustness_summary.docx
@@ -1015,9 +1015,9 @@
       <w:r>
         <w:drawing>
           <wp:inline distT="0" distB="0" distL="0" distR="0">
-            <wp:extent cx="5715000" cy="1714500"/>
+            <wp:extent cx="5715000" cy="1695450"/>
             <wp:effectExtent t="0" r="0" b="0" l="0"/>
-            <wp:docPr id="1" name="ws1_threshold_surface.png" descr="Threshold surfaces for the thematic entry hurdle, its out-of-sample version, and the market-breadth brake" title="Threshold surfaces for the thematic entry hurdle, its out-of-sample version, and the market-breadth brake"/>
+            <wp:docPr id="1" name="ws1_threshold_summary.png" descr="Each dial shown as first half (in-sample), second half (out-of-sample) and the gap between them" title="Each dial shown as first half (in-sample), second half (out-of-sample) and the gap between them"/>
             <wp:cNvGraphicFramePr>
               <a:graphicFrameLocks xmlns:a="http://schemas.openxmlformats.org/drawingml/2006/main" noChangeAspect="1"/>
             </wp:cNvGraphicFramePr>
@@ -1040,7 +1040,7 @@
                   <pic:spPr bwMode="auto">
                     <a:xfrm>
                       <a:off x="0" y="0"/>
-                      <a:ext cx="5715000" cy="1714500"/>
+                      <a:ext cx="5715000" cy="1695450"/>
                     </a:xfrm>
                     <a:prstGeom prst="rect">
                       <a:avLst/>
@@ -1065,7 +1065,7 @@
           <w:sz w:val="18"/>
           <w:szCs w:val="18"/>
         </w:rPr>
-        <w:t xml:space="preserve">Reading this: the colour is in-sample return only. A darker cell is not automatically better, because the choice also weighs out-of-sample return, worst loss, and whether the book is genuinely invested (* = mostly cash). Left vs centre — the dark high-trigger cells earn their shade in the first half of history and fade in the second, or are mostly cash. The one cell that is genuinely better out of sample — removing the +5% hurdle — lifts return but deepens the book's worst loss from −36% to −48% (all in 2022); it is the single flagged item for the final review, not an oversight. Right — the market-breadth brake: every trigger combination beats running without it (+1.20), and the spread across the green cells is about 0.03 — inside the margin of error — so the exact trigger is a flat choice; the deployed levels de-risk on a genuine breadth collapse.</w:t>
+        <w:t xml:space="preserve">This is how to read the earlier heatmaps honestly — by the split between the data a setting was designed on and unseen data. Each dial has three panels: first half of history (in-sample), second half (out-of-sample, same colour scale), and the difference (right). Thematic hurdle (top): the dark high-trigger cells on the left turn orange on the right — they looked good only on their design data, and the difference panel flags them red. The deployed cell (outlined) holds up and stays pale. Market-breadth brake (bottom): every cell holds up or improves out of sample (all blue on the right), so the whole surface is robust and its small differences are noise. The one thematic cell that is genuinely better out of sample — removing the +5% hurdle (top-left, not overfit) — was declined on drawdown (worst loss −36% to −48%, all in 2022) and is the single flagged item for the final review.</w:t>
       </w:r>
     </w:p>
     <w:p>

</xml_diff>

<commit_message>
Summary A4: make the threshold split legible — two large panels per dial
The previous single six-panel image left each cell ~40px wide, so the
numbers rendered too small to read. Replace it with one figure per dial,
each showing two large panels: out-of-sample return (the honest test) and
an overfitting map (how much higher the cell looked in-sample; red = fitted
to the past). Cells are now ~60px with comfortably readable values, and the
appendix fits on five pages with no orphan.

Retires the combined ws1_threshold_summary.png in favour of
ws1_threshold_hurdle.png and ws1_threshold_brake.png, both from
scripts/plot_ws1_summary_charts.py.
</commit_message>
<xml_diff>
--- a/reviews/2026-07-03_ws0-ws1_ma-robustness_summary.docx
+++ b/reviews/2026-07-03_ws0-ws1_ma-robustness_summary.docx
@@ -1009,15 +1009,28 @@
     </w:p>
     <w:p>
       <w:pPr>
+        <w:spacing w:after="60" w:line="264"/>
+      </w:pPr>
+      <w:r>
+        <w:rPr>
+          <w:color w:val="444444"/>
+          <w:sz w:val="20"/>
+          <w:szCs w:val="20"/>
+        </w:rPr>
+        <w:t xml:space="preserve">This is how to read the earlier heatmaps honestly. For each dial, the left panel is return on unseen data (the honest test), and the right panel is how much higher the cell looked on the data it was designed on — red means the shine was fitted to the past. A darker cell on the original heatmap is only better if it stays green on the left here and pale on the right.</w:t>
+      </w:r>
+    </w:p>
+    <w:p>
+      <w:pPr>
         <w:spacing w:after="110" w:before="30"/>
         <w:jc w:val="center"/>
       </w:pPr>
       <w:r>
         <w:drawing>
           <wp:inline distT="0" distB="0" distL="0" distR="0">
-            <wp:extent cx="5715000" cy="1695450"/>
+            <wp:extent cx="5715000" cy="1257300"/>
             <wp:effectExtent t="0" r="0" b="0" l="0"/>
-            <wp:docPr id="1" name="ws1_threshold_summary.png" descr="Each dial shown as first half (in-sample), second half (out-of-sample) and the gap between them" title="Each dial shown as first half (in-sample), second half (out-of-sample) and the gap between them"/>
+            <wp:docPr id="1" name="ws1_threshold_hurdle.png" descr="Thematic entry hurdle — out-of-sample return, and how much was fitted to the past" title="Thematic entry hurdle — out-of-sample return, and how much was fitted to the past"/>
             <wp:cNvGraphicFramePr>
               <a:graphicFrameLocks xmlns:a="http://schemas.openxmlformats.org/drawingml/2006/main" noChangeAspect="1"/>
             </wp:cNvGraphicFramePr>
@@ -1040,7 +1053,7 @@
                   <pic:spPr bwMode="auto">
                     <a:xfrm>
                       <a:off x="0" y="0"/>
-                      <a:ext cx="5715000" cy="1695450"/>
+                      <a:ext cx="5715000" cy="1257300"/>
                     </a:xfrm>
                     <a:prstGeom prst="rect">
                       <a:avLst/>
@@ -1055,7 +1068,7 @@
     </w:p>
     <w:p>
       <w:pPr>
-        <w:spacing w:after="160" w:line="264"/>
+        <w:spacing w:after="140" w:line="264"/>
       </w:pPr>
       <w:r>
         <w:rPr>
@@ -1065,7 +1078,68 @@
           <w:sz w:val="18"/>
           <w:szCs w:val="18"/>
         </w:rPr>
-        <w:t xml:space="preserve">This is how to read the earlier heatmaps honestly — by the split between the data a setting was designed on and unseen data. Each dial has three panels: first half of history (in-sample), second half (out-of-sample, same colour scale), and the difference (right). Thematic hurdle (top): the dark high-trigger cells on the left turn orange on the right — they looked good only on their design data, and the difference panel flags them red. The deployed cell (outlined) holds up and stays pale. Market-breadth brake (bottom): every cell holds up or improves out of sample (all blue on the right), so the whole surface is robust and its small differences are noise. The one thematic cell that is genuinely better out of sample — removing the +5% hurdle (top-left, not overfit) — was declined on drawdown (worst loss −36% to −48%, all in 2022) and is the single flagged item for the final review.</w:t>
+        <w:t xml:space="preserve">The dark high-trigger cells look best in-sample but light up red on the right — fitted to the past — so they are not chosen. The deployed cell (outlined) holds up out of sample and stays pale. The one cell genuinely better out of sample is removing the +5% hurdle (top row, pale on the right, not overfit) — declined on drawdown (worst loss −36% to −48%, all in 2022), the single flagged item for the final review.</w:t>
+      </w:r>
+    </w:p>
+    <w:p>
+      <w:pPr>
+        <w:spacing w:after="110" w:before="30"/>
+        <w:jc w:val="center"/>
+      </w:pPr>
+      <w:r>
+        <w:drawing>
+          <wp:inline distT="0" distB="0" distL="0" distR="0">
+            <wp:extent cx="5715000" cy="1466850"/>
+            <wp:effectExtent t="0" r="0" b="0" l="0"/>
+            <wp:docPr id="1" name="ws1_threshold_brake.png" descr="Market-breadth brake — out-of-sample return, and how much was fitted to the past" title="Market-breadth brake — out-of-sample return, and how much was fitted to the past"/>
+            <wp:cNvGraphicFramePr>
+              <a:graphicFrameLocks xmlns:a="http://schemas.openxmlformats.org/drawingml/2006/main" noChangeAspect="1"/>
+            </wp:cNvGraphicFramePr>
+            <a:graphic xmlns:a="http://schemas.openxmlformats.org/drawingml/2006/main">
+              <a:graphicData uri="http://schemas.openxmlformats.org/drawingml/2006/picture">
+                <pic:pic xmlns:pic="http://schemas.openxmlformats.org/drawingml/2006/picture">
+                  <pic:nvPicPr>
+                    <pic:cNvPr id="0" name="" descr=""/>
+                    <pic:cNvPicPr>
+                      <a:picLocks noChangeAspect="1" noChangeArrowheads="1"/>
+                    </pic:cNvPicPr>
+                  </pic:nvPicPr>
+                  <pic:blipFill>
+                    <a:blip r:embed="rId19" cstate="none"/>
+                    <a:srcRect/>
+                    <a:stretch>
+                      <a:fillRect/>
+                    </a:stretch>
+                  </pic:blipFill>
+                  <pic:spPr bwMode="auto">
+                    <a:xfrm>
+                      <a:off x="0" y="0"/>
+                      <a:ext cx="5715000" cy="1466850"/>
+                    </a:xfrm>
+                    <a:prstGeom prst="rect">
+                      <a:avLst/>
+                    </a:prstGeom>
+                  </pic:spPr>
+                </pic:pic>
+              </a:graphicData>
+            </a:graphic>
+          </wp:inline>
+        </w:drawing>
+      </w:r>
+    </w:p>
+    <w:p>
+      <w:pPr>
+        <w:spacing w:after="160" w:line="264"/>
+      </w:pPr>
+      <w:r>
+        <w:rPr>
+          <w:i/>
+          <w:iCs/>
+          <w:color w:val="666666"/>
+          <w:sz w:val="18"/>
+          <w:szCs w:val="18"/>
+        </w:rPr>
+        <w:t xml:space="preserve">Every trigger setting works out of sample (green, left) and is pale-to-blue on the right — nothing fitted to the past — so the whole surface is robust and the small gaps between cells are noise. The deployed levels (outlined) de-risk on a genuine breadth collapse.</w:t>
       </w:r>
     </w:p>
     <w:p>

</xml_diff>

<commit_message>
Summary A4: one absolute green scale — a strong cell never looks red
Fixes two optics problems in the threshold figures. The brake's deployed
+1.41 rendered RED because each panel was coloured relative to its own
narrow range (1.37-1.58), so a strong cell sat at the red end of a
uniformly-good surface and looked like a bad choice. And the diverging
blue overfitting map read inconsistently against the green panels.

Both dials now use ONE shared absolute green scale (green = strong Sharpe,
fixed 0-1.6) across all panels, and the split is shown as first-half
(in-sample) beside second-half (out-of-sample). The deployed +1.41 is now
solid green; the thematic hurdle's overfit cells fade from bright green
in-sample to orange out-of-sample; no blue anywhere, one colour language
top and bottom. Figure height trimmed to keep the appendix at five pages.
</commit_message>
<xml_diff>
--- a/reviews/2026-07-03_ws0-ws1_ma-robustness_summary.docx
+++ b/reviews/2026-07-03_ws0-ws1_ma-robustness_summary.docx
@@ -1009,7 +1009,7 @@
     </w:p>
     <w:p>
       <w:pPr>
-        <w:spacing w:after="60" w:line="264"/>
+        <w:spacing w:after="40" w:line="264"/>
       </w:pPr>
       <w:r>
         <w:rPr>
@@ -1017,7 +1017,7 @@
           <w:sz w:val="20"/>
           <w:szCs w:val="20"/>
         </w:rPr>
-        <w:t xml:space="preserve">This is how to read the earlier heatmaps honestly. For each dial, the left panel is return on unseen data (the honest test), and the right panel is how much higher the cell looked on the data it was designed on — red means the shine was fitted to the past. A darker cell on the original heatmap is only better if it stays green on the left here and pale on the right.</w:t>
+        <w:t xml:space="preserve">For each dial, the left panel is the first half of history (the data the settings were designed on) and the right panel is the second half (unseen). Both use one green scale — green means strong risk-adjusted return — so a setting that is bright green on the left but fades on the right looked good only because it was fitted to the past.</w:t>
       </w:r>
     </w:p>
     <w:p>
@@ -1028,9 +1028,9 @@
       <w:r>
         <w:drawing>
           <wp:inline distT="0" distB="0" distL="0" distR="0">
-            <wp:extent cx="5715000" cy="1257300"/>
+            <wp:extent cx="5715000" cy="1066800"/>
             <wp:effectExtent t="0" r="0" b="0" l="0"/>
-            <wp:docPr id="1" name="ws1_threshold_hurdle.png" descr="Thematic entry hurdle — out-of-sample return, and how much was fitted to the past" title="Thematic entry hurdle — out-of-sample return, and how much was fitted to the past"/>
+            <wp:docPr id="1" name="ws1_threshold_hurdle.png" descr="Thematic entry hurdle — first half (in-sample) beside second half (out-of-sample)" title="Thematic entry hurdle — first half (in-sample) beside second half (out-of-sample)"/>
             <wp:cNvGraphicFramePr>
               <a:graphicFrameLocks xmlns:a="http://schemas.openxmlformats.org/drawingml/2006/main" noChangeAspect="1"/>
             </wp:cNvGraphicFramePr>
@@ -1053,7 +1053,7 @@
                   <pic:spPr bwMode="auto">
                     <a:xfrm>
                       <a:off x="0" y="0"/>
-                      <a:ext cx="5715000" cy="1257300"/>
+                      <a:ext cx="5715000" cy="1066800"/>
                     </a:xfrm>
                     <a:prstGeom prst="rect">
                       <a:avLst/>
@@ -1078,7 +1078,7 @@
           <w:sz w:val="18"/>
           <w:szCs w:val="18"/>
         </w:rPr>
-        <w:t xml:space="preserve">The dark high-trigger cells look best in-sample but light up red on the right — fitted to the past — so they are not chosen. The deployed cell (outlined) holds up out of sample and stays pale. The one cell genuinely better out of sample is removing the +5% hurdle (top row, pale on the right, not overfit) — declined on drawdown (worst loss −36% to −48%, all in 2022), the single flagged item for the final review.</w:t>
+        <w:t xml:space="preserve">The high-trigger cells (right side of each panel) are bright green in-sample and fade to orange out of sample — fitted to the past, so they are not chosen. The deployed cell (outlined) keeps its colour across both halves. Removing the +5% hurdle (top row) also holds up out of sample; it was declined on drawdown (worst loss −36% to −48%, all in 2022), the single flagged item for the final review.</w:t>
       </w:r>
     </w:p>
     <w:p>
@@ -1089,9 +1089,9 @@
       <w:r>
         <w:drawing>
           <wp:inline distT="0" distB="0" distL="0" distR="0">
-            <wp:extent cx="5715000" cy="1466850"/>
+            <wp:extent cx="5715000" cy="1476375"/>
             <wp:effectExtent t="0" r="0" b="0" l="0"/>
-            <wp:docPr id="1" name="ws1_threshold_brake.png" descr="Market-breadth brake — out-of-sample return, and how much was fitted to the past" title="Market-breadth brake — out-of-sample return, and how much was fitted to the past"/>
+            <wp:docPr id="1" name="ws1_threshold_brake.png" descr="Market-breadth brake — first half (in-sample) beside second half (out-of-sample)" title="Market-breadth brake — first half (in-sample) beside second half (out-of-sample)"/>
             <wp:cNvGraphicFramePr>
               <a:graphicFrameLocks xmlns:a="http://schemas.openxmlformats.org/drawingml/2006/main" noChangeAspect="1"/>
             </wp:cNvGraphicFramePr>
@@ -1114,7 +1114,7 @@
                   <pic:spPr bwMode="auto">
                     <a:xfrm>
                       <a:off x="0" y="0"/>
-                      <a:ext cx="5715000" cy="1466850"/>
+                      <a:ext cx="5715000" cy="1476375"/>
                     </a:xfrm>
                     <a:prstGeom prst="rect">
                       <a:avLst/>
@@ -1129,7 +1129,7 @@
     </w:p>
     <w:p>
       <w:pPr>
-        <w:spacing w:after="160" w:line="264"/>
+        <w:spacing w:after="120" w:line="264"/>
       </w:pPr>
       <w:r>
         <w:rPr>
@@ -1139,7 +1139,7 @@
           <w:sz w:val="18"/>
           <w:szCs w:val="18"/>
         </w:rPr>
-        <w:t xml:space="preserve">Every trigger setting works out of sample (green, left) and is pale-to-blue on the right — nothing fitted to the past — so the whole surface is robust and the small gaps between cells are noise. The deployed levels (outlined) de-risk on a genuine breadth collapse.</w:t>
+        <w:t xml:space="preserve">Both halves are solid green — every trigger setting is strong and holds up out of sample — so the surface is robust and the small gaps between cells are noise. The deployed +1.41 is a strong reading; the deployed levels (outlined) de-risk on a genuine breadth collapse.</w:t>
       </w:r>
     </w:p>
     <w:p>

</xml_diff>

<commit_message>
Summary finding 3: name and explain the volatility-adjusted signal
The volatility-adjusted moving-average signal was the review's headline
proposed upgrade (the prompt's preferred replacement: one vol-scaled
setting to fit bonds, equities and crypto alike), but the summary buried
it as one of "seventeen variants" without naming it. Finding 3 now leads
with it explicitly: what it is (adjust each holding's trend reading by its
own volatility), why it backfired (it shrinks the signal on exactly the
strongest, most volatile trends the strategy should ride), and the numbers
(blend 1.20 -> 0.89, every book lower individually). The chart's red bar is
relabelled "Volatility-adjusted, multi-speed signal (all books)".

Also promotes the finding-chart generator from a scratchpad one-off to a
committed, reproducible script (scripts/plot_ws1_summary_findings.py).
</commit_message>
<xml_diff>
--- a/reviews/2026-07-03_ws0-ws1_ma-robustness_summary.docx
+++ b/reviews/2026-07-03_ws0-ws1_ma-robustness_summary.docx
@@ -488,7 +488,7 @@
           <w:sz w:val="24"/>
           <w:szCs w:val="24"/>
         </w:rPr>
-        <w:t xml:space="preserve">3. Cleverer signal mathematics did not help.</w:t>
+        <w:t xml:space="preserve">3. The main proposed upgrade — a volatility-adjusted signal — made it worse, not better.</w:t>
       </w:r>
     </w:p>
     <w:p>
@@ -500,7 +500,7 @@
         <w:rPr>
           <w:color w:val="444444"/>
         </w:rPr>
-        <w:t xml:space="preserve">Sixteen of seventeen more sophisticated variants — volatility-adjusted signals, blends of several trend speeds — were worse on unseen data; the simple version is the strong version.</w:t>
+        <w:t xml:space="preserve">The headline idea for improving the strategy was to adjust each holding's trend reading by how volatile it is, so one setting could fit calm bonds and wild crypto alike. It backfired: it shrinks the signal on exactly the strongest, most volatile trends the strategy should ride, cutting risk-adjusted return from 1.20 to 0.89 when applied across all four books — and it lowered every book individually. None of the seventeen sophisticated variants tried (volatility-adjustment, blends of several trend speeds) beat the simple signal on unseen data.</w:t>
       </w:r>
     </w:p>
     <w:p>
@@ -513,7 +513,7 @@
           <wp:inline distT="0" distB="0" distL="0" distR="0">
             <wp:extent cx="5524500" cy="1304925"/>
             <wp:effectExtent t="0" r="0" b="0" l="0"/>
-            <wp:docPr id="1" name="ws1_sum_smarter.png" descr="The deployed simple signal matches the best alternative and far exceeds the fully sophisticated version" title="The deployed simple signal matches the best alternative and far exceeds the fully sophisticated version"/>
+            <wp:docPr id="1" name="ws1_sum_smarter.png" descr="The volatility-adjusted, multi-speed signal scored 0.89 versus 1.20 for the deployed simple signal" title="The volatility-adjusted, multi-speed signal scored 0.89 versus 1.20 for the deployed simple signal"/>
             <wp:cNvGraphicFramePr>
               <a:graphicFrameLocks xmlns:a="http://schemas.openxmlformats.org/drawingml/2006/main" noChangeAspect="1"/>
             </wp:cNvGraphicFramePr>

</xml_diff>